<commit_message>
feat: embed 8 high-resolution real-world data and benchmark charts into Word report and PowerPoint slides
</commit_message>
<xml_diff>
--- a/docs/BAO_CAO_CSDL_NANG_CAO.docx
+++ b/docs/BAO_CAO_CSDL_NANG_CAO.docx
@@ -187,6 +187,75 @@
     </w:p>
     <w:p>
       <w:pPr>
+        <w:pStyle w:val="Heading2"/>
+      </w:pPr>
+      <w:r>
+        <w:t>1.2. Mô hình Dữ liệu Thực tế và Sơ đồ Quan hệ Thực thể (ERD)</w:t>
+      </w:r>
+    </w:p>
+    <w:p>
+      <w:r>
+        <w:t>Dữ liệu thực nghiệm của đề tài là 100% dữ liệu giao dịch thương mại điện tử thực tế từ sàn Olist Store tại Brazil, được cấu trúc thành 8 bảng quan hệ chuẩn hóa 3NF với đầy đủ các khóa chính, khóa ngoại và ràng buộc toàn vẹn. Tổng dung lượng CSDL vật lý đạt 85,07 MB với hơn 500.000 dòng bản ghi tổng cộng:</w:t>
+      </w:r>
+    </w:p>
+    <w:p>
+      <w:pPr>
+        <w:spacing w:before="200" w:after="60"/>
+        <w:jc w:val="center"/>
+      </w:pPr>
+      <w:r>
+        <w:drawing>
+          <wp:inline xmlns:a="http://schemas.openxmlformats.org/drawingml/2006/main" xmlns:pic="http://schemas.openxmlformats.org/drawingml/2006/picture">
+            <wp:extent cx="5669280" cy="3458004"/>
+            <wp:docPr id="1" name="Picture 1"/>
+            <wp:cNvGraphicFramePr>
+              <a:graphicFrameLocks noChangeAspect="1"/>
+            </wp:cNvGraphicFramePr>
+            <a:graphic>
+              <a:graphicData uri="http://schemas.openxmlformats.org/drawingml/2006/picture">
+                <pic:pic>
+                  <pic:nvPicPr>
+                    <pic:cNvPr id="0" name="fig1_database_erd.png"/>
+                    <pic:cNvPicPr/>
+                  </pic:nvPicPr>
+                  <pic:blipFill>
+                    <a:blip r:embed="rId9"/>
+                    <a:stretch>
+                      <a:fillRect/>
+                    </a:stretch>
+                  </pic:blipFill>
+                  <pic:spPr>
+                    <a:xfrm>
+                      <a:off x="0" y="0"/>
+                      <a:ext cx="5669280" cy="3458004"/>
+                    </a:xfrm>
+                    <a:prstGeom prst="rect"/>
+                  </pic:spPr>
+                </pic:pic>
+              </a:graphicData>
+            </a:graphic>
+          </wp:inline>
+        </w:drawing>
+      </w:r>
+    </w:p>
+    <w:p>
+      <w:pPr>
+        <w:spacing w:before="40" w:after="240"/>
+        <w:jc w:val="center"/>
+      </w:pPr>
+      <w:r>
+        <w:rPr>
+          <w:rFonts w:ascii="Times New Roman" w:hAnsi="Times New Roman"/>
+          <w:b/>
+          <w:i/>
+          <w:color w:val="1F4E79"/>
+          <w:sz w:val="20"/>
+        </w:rPr>
+        <w:t>Hình 1.1: Sơ đồ Quan hệ Thực thể (ERD) 8 bảng chuẩn 3NF của CSDL thương mại điện tử thực tế Olist Store (Quy mô 100.000 đơn hàng, 85,07 MB)</w:t>
+      </w:r>
+    </w:p>
+    <w:p>
+      <w:pPr>
         <w:pStyle w:val="Heading1"/>
       </w:pPr>
       <w:r>
@@ -220,7 +289,123 @@
         <w:t>2. Chỉ mục có điều kiện (Partial Index): Chỉ lập chỉ mục trên tập con các bản ghi thỏa mãn điều kiện vị từ (ví dụ: WHERE order_status = 'delivered'). Kỹ thuật này giúp tiết kiệm tới 70% dung lượng đĩa của cây chỉ mục và giảm chi phí cập nhật chỉ mục khi ghi dữ liệu (Bruno &amp; Chaudhuri 2002).</w:t>
         <w:br/>
         <w:br/>
+      </w:r>
+    </w:p>
+    <w:p>
+      <w:pPr>
+        <w:spacing w:before="200" w:after="60"/>
+        <w:jc w:val="center"/>
+      </w:pPr>
+      <w:r>
+        <w:drawing>
+          <wp:inline xmlns:a="http://schemas.openxmlformats.org/drawingml/2006/main" xmlns:pic="http://schemas.openxmlformats.org/drawingml/2006/picture">
+            <wp:extent cx="5669280" cy="2618426"/>
+            <wp:docPr id="2" name="Picture 2"/>
+            <wp:cNvGraphicFramePr>
+              <a:graphicFrameLocks noChangeAspect="1"/>
+            </wp:cNvGraphicFramePr>
+            <a:graphic>
+              <a:graphicData uri="http://schemas.openxmlformats.org/drawingml/2006/picture">
+                <pic:pic>
+                  <pic:nvPicPr>
+                    <pic:cNvPr id="0" name="fig2_order_status_distribution.png"/>
+                    <pic:cNvPicPr/>
+                  </pic:nvPicPr>
+                  <pic:blipFill>
+                    <a:blip r:embed="rId10"/>
+                    <a:stretch>
+                      <a:fillRect/>
+                    </a:stretch>
+                  </pic:blipFill>
+                  <pic:spPr>
+                    <a:xfrm>
+                      <a:off x="0" y="0"/>
+                      <a:ext cx="5669280" cy="2618426"/>
+                    </a:xfrm>
+                    <a:prstGeom prst="rect"/>
+                  </pic:spPr>
+                </pic:pic>
+              </a:graphicData>
+            </a:graphic>
+          </wp:inline>
+        </w:drawing>
+      </w:r>
+    </w:p>
+    <w:p>
+      <w:pPr>
+        <w:spacing w:before="40" w:after="240"/>
+        <w:jc w:val="center"/>
+      </w:pPr>
+      <w:r>
+        <w:rPr>
+          <w:rFonts w:ascii="Times New Roman" w:hAnsi="Times New Roman"/>
+          <w:b/>
+          <w:i/>
+          <w:color w:val="1F4E79"/>
+          <w:sz w:val="20"/>
+        </w:rPr>
+        <w:t>Hình 3.1: Phân bố số lượng và tỷ lệ trạng thái đơn hàng trong CSDL thực tế – Minh chứng thực nghiệm cho Hiện tượng Nghịch lý Độ chọn lọc thấp (Trạng thái 'delivered' chiếm 97,02%)</w:t>
+      </w:r>
+    </w:p>
+    <w:p>
+      <w:r>
         <w:t>3. Chỉ mục bao phủ (Covering Index) &amp; Quét thuần chỉ mục (INDEX-ONLY SCAN): Khi tất cả các thuộc tính xuất hiện trong câu lệnh SELECT đều nằm sẵn trong cây chỉ mục B-Tree, công cụ CSDL hoàn toàn không cần phải thực hiện thao tác đọc trang bảng dữ liệu (Heap Table Lookups). Điều này triệt tiêu toàn bộ chi phí I/O đọc đĩa ngẫu nhiên, giúp câu truy vấn đạt tốc độ tối đa.</w:t>
+      </w:r>
+    </w:p>
+    <w:p>
+      <w:pPr>
+        <w:spacing w:before="200" w:after="60"/>
+        <w:jc w:val="center"/>
+      </w:pPr>
+      <w:r>
+        <w:drawing>
+          <wp:inline xmlns:a="http://schemas.openxmlformats.org/drawingml/2006/main" xmlns:pic="http://schemas.openxmlformats.org/drawingml/2006/picture">
+            <wp:extent cx="5669280" cy="2821456"/>
+            <wp:docPr id="3" name="Picture 3"/>
+            <wp:cNvGraphicFramePr>
+              <a:graphicFrameLocks noChangeAspect="1"/>
+            </wp:cNvGraphicFramePr>
+            <a:graphic>
+              <a:graphicData uri="http://schemas.openxmlformats.org/drawingml/2006/picture">
+                <pic:pic>
+                  <pic:nvPicPr>
+                    <pic:cNvPr id="0" name="fig8_index_scan_vs_index_only.png"/>
+                    <pic:cNvPicPr/>
+                  </pic:nvPicPr>
+                  <pic:blipFill>
+                    <a:blip r:embed="rId11"/>
+                    <a:stretch>
+                      <a:fillRect/>
+                    </a:stretch>
+                  </pic:blipFill>
+                  <pic:spPr>
+                    <a:xfrm>
+                      <a:off x="0" y="0"/>
+                      <a:ext cx="5669280" cy="2821456"/>
+                    </a:xfrm>
+                    <a:prstGeom prst="rect"/>
+                  </pic:spPr>
+                </pic:pic>
+              </a:graphicData>
+            </a:graphic>
+          </wp:inline>
+        </w:drawing>
+      </w:r>
+    </w:p>
+    <w:p>
+      <w:pPr>
+        <w:spacing w:before="40" w:after="240"/>
+        <w:jc w:val="center"/>
+      </w:pPr>
+      <w:r>
+        <w:rPr>
+          <w:rFonts w:ascii="Times New Roman" w:hAnsi="Times New Roman"/>
+          <w:b/>
+          <w:i/>
+          <w:color w:val="1F4E79"/>
+          <w:sz w:val="20"/>
+        </w:rPr>
+        <w:t>Hình 3.2: So sánh bản chất vật lý giữa Index Scan thông thường (phải đọc Random I/O vào Table Heap) và Covering Index (INDEX-ONLY SCAN triệt tiêu 100% Heap Lookups)</w:t>
       </w:r>
     </w:p>
     <w:p>
@@ -251,6 +436,118 @@
     </w:p>
     <w:p>
       <w:pPr>
+        <w:spacing w:before="200" w:after="60"/>
+        <w:jc w:val="center"/>
+      </w:pPr>
+      <w:r>
+        <w:drawing>
+          <wp:inline xmlns:a="http://schemas.openxmlformats.org/drawingml/2006/main" xmlns:pic="http://schemas.openxmlformats.org/drawingml/2006/picture">
+            <wp:extent cx="5669280" cy="2810819"/>
+            <wp:docPr id="4" name="Picture 4"/>
+            <wp:cNvGraphicFramePr>
+              <a:graphicFrameLocks noChangeAspect="1"/>
+            </wp:cNvGraphicFramePr>
+            <a:graphic>
+              <a:graphicData uri="http://schemas.openxmlformats.org/drawingml/2006/picture">
+                <pic:pic>
+                  <pic:nvPicPr>
+                    <pic:cNvPr id="0" name="fig4_top_categories_revenue.png"/>
+                    <pic:cNvPicPr/>
+                  </pic:nvPicPr>
+                  <pic:blipFill>
+                    <a:blip r:embed="rId12"/>
+                    <a:stretch>
+                      <a:fillRect/>
+                    </a:stretch>
+                  </pic:blipFill>
+                  <pic:spPr>
+                    <a:xfrm>
+                      <a:off x="0" y="0"/>
+                      <a:ext cx="5669280" cy="2810819"/>
+                    </a:xfrm>
+                    <a:prstGeom prst="rect"/>
+                  </pic:spPr>
+                </pic:pic>
+              </a:graphicData>
+            </a:graphic>
+          </wp:inline>
+        </w:drawing>
+      </w:r>
+    </w:p>
+    <w:p>
+      <w:pPr>
+        <w:spacing w:before="40" w:after="240"/>
+        <w:jc w:val="center"/>
+      </w:pPr>
+      <w:r>
+        <w:rPr>
+          <w:rFonts w:ascii="Times New Roman" w:hAnsi="Times New Roman"/>
+          <w:b/>
+          <w:i/>
+          <w:color w:val="1F4E79"/>
+          <w:sz w:val="20"/>
+        </w:rPr>
+        <w:t>Hình 4.1: Doanh thu thực tế theo ngành hàng và số lượng đơn hàng năm 2017 (Kết quả thực thi câu truy vấn đối chuẩn Q2 kết nối 3 bảng)</w:t>
+      </w:r>
+    </w:p>
+    <w:p>
+      <w:pPr>
+        <w:spacing w:before="200" w:after="60"/>
+        <w:jc w:val="center"/>
+      </w:pPr>
+      <w:r>
+        <w:drawing>
+          <wp:inline xmlns:a="http://schemas.openxmlformats.org/drawingml/2006/main" xmlns:pic="http://schemas.openxmlformats.org/drawingml/2006/picture">
+            <wp:extent cx="5669280" cy="2323346"/>
+            <wp:docPr id="5" name="Picture 5"/>
+            <wp:cNvGraphicFramePr>
+              <a:graphicFrameLocks noChangeAspect="1"/>
+            </wp:cNvGraphicFramePr>
+            <a:graphic>
+              <a:graphicData uri="http://schemas.openxmlformats.org/drawingml/2006/picture">
+                <pic:pic>
+                  <pic:nvPicPr>
+                    <pic:cNvPr id="0" name="fig5_payment_distribution.png"/>
+                    <pic:cNvPicPr/>
+                  </pic:nvPicPr>
+                  <pic:blipFill>
+                    <a:blip r:embed="rId13"/>
+                    <a:stretch>
+                      <a:fillRect/>
+                    </a:stretch>
+                  </pic:blipFill>
+                  <pic:spPr>
+                    <a:xfrm>
+                      <a:off x="0" y="0"/>
+                      <a:ext cx="5669280" cy="2323346"/>
+                    </a:xfrm>
+                    <a:prstGeom prst="rect"/>
+                  </pic:spPr>
+                </pic:pic>
+              </a:graphicData>
+            </a:graphic>
+          </wp:inline>
+        </w:drawing>
+      </w:r>
+    </w:p>
+    <w:p>
+      <w:pPr>
+        <w:spacing w:before="40" w:after="240"/>
+        <w:jc w:val="center"/>
+      </w:pPr>
+      <w:r>
+        <w:rPr>
+          <w:rFonts w:ascii="Times New Roman" w:hAnsi="Times New Roman"/>
+          <w:b/>
+          <w:i/>
+          <w:color w:val="1F4E79"/>
+          <w:sz w:val="20"/>
+        </w:rPr>
+        <w:t>Hình 4.2: Cơ cấu phương thức thanh toán và số kỳ trả góp trong bảng order_payments (Truy vấn đối chuẩn Q4 kết nối 5 bảng)</w:t>
+      </w:r>
+    </w:p>
+    <w:p>
+      <w:pPr>
         <w:pStyle w:val="Heading1"/>
       </w:pPr>
       <w:r>
@@ -263,6 +560,62 @@
         <w:br/>
         <w:br/>
         <w:t>Cơ chế Loại trừ Phân vùng (Partition Pruning): Khi câu lệnh SQL chứa vị từ lọc trên khóa phân vùng (ví dụ: WHERE order_purchase_timestamp BETWEEN '2017-06-01' AND '2017-08-31'), bộ tối ưu hóa truy vấn sẽ kiểm tra các ràng buộc kiểm tra của từng phân vùng và tự động loại bỏ hoàn toàn các phân vùng không chứa dữ liệu thỏa mãn khỏi cây kế hoạch thực thi. Thay vì phải quét toàn bộ bảng 100.000 dòng, hệ thống chỉ đọc phân vùng của năm 2017, cắt giảm trực tiếp từ 60% đến 90% số lượng trang đĩa cần đọc.</w:t>
+      </w:r>
+    </w:p>
+    <w:p>
+      <w:pPr>
+        <w:spacing w:before="200" w:after="60"/>
+        <w:jc w:val="center"/>
+      </w:pPr>
+      <w:r>
+        <w:drawing>
+          <wp:inline xmlns:a="http://schemas.openxmlformats.org/drawingml/2006/main" xmlns:pic="http://schemas.openxmlformats.org/drawingml/2006/picture">
+            <wp:extent cx="5669280" cy="2372335"/>
+            <wp:docPr id="6" name="Picture 6"/>
+            <wp:cNvGraphicFramePr>
+              <a:graphicFrameLocks noChangeAspect="1"/>
+            </wp:cNvGraphicFramePr>
+            <a:graphic>
+              <a:graphicData uri="http://schemas.openxmlformats.org/drawingml/2006/picture">
+                <pic:pic>
+                  <pic:nvPicPr>
+                    <pic:cNvPr id="0" name="fig3_orders_time_series_partitioning.png"/>
+                    <pic:cNvPicPr/>
+                  </pic:nvPicPr>
+                  <pic:blipFill>
+                    <a:blip r:embed="rId14"/>
+                    <a:stretch>
+                      <a:fillRect/>
+                    </a:stretch>
+                  </pic:blipFill>
+                  <pic:spPr>
+                    <a:xfrm>
+                      <a:off x="0" y="0"/>
+                      <a:ext cx="5669280" cy="2372335"/>
+                    </a:xfrm>
+                    <a:prstGeom prst="rect"/>
+                  </pic:spPr>
+                </pic:pic>
+              </a:graphicData>
+            </a:graphic>
+          </wp:inline>
+        </w:drawing>
+      </w:r>
+    </w:p>
+    <w:p>
+      <w:pPr>
+        <w:spacing w:before="40" w:after="240"/>
+        <w:jc w:val="center"/>
+      </w:pPr>
+      <w:r>
+        <w:rPr>
+          <w:rFonts w:ascii="Times New Roman" w:hAnsi="Times New Roman"/>
+          <w:b/>
+          <w:i/>
+          <w:color w:val="1F4E79"/>
+          <w:sz w:val="20"/>
+        </w:rPr>
+        <w:t>Hình 5.1: Chuỗi thời gian phân bố đơn hàng thực tế (2016 - 2018) và ranh giới phân vùng bảng phục vụ kỹ thuật Cắt tỉa Phân vùng (Partition Pruning)</w:t>
       </w:r>
     </w:p>
     <w:p>
@@ -905,6 +1258,62 @@
     </w:p>
     <w:p>
       <w:pPr>
+        <w:spacing w:before="200" w:after="60"/>
+        <w:jc w:val="center"/>
+      </w:pPr>
+      <w:r>
+        <w:drawing>
+          <wp:inline xmlns:a="http://schemas.openxmlformats.org/drawingml/2006/main" xmlns:pic="http://schemas.openxmlformats.org/drawingml/2006/picture">
+            <wp:extent cx="5669280" cy="2824263"/>
+            <wp:docPr id="7" name="Picture 7"/>
+            <wp:cNvGraphicFramePr>
+              <a:graphicFrameLocks noChangeAspect="1"/>
+            </wp:cNvGraphicFramePr>
+            <a:graphic>
+              <a:graphicData uri="http://schemas.openxmlformats.org/drawingml/2006/picture">
+                <pic:pic>
+                  <pic:nvPicPr>
+                    <pic:cNvPr id="0" name="fig6_query_latency_comparison.png"/>
+                    <pic:cNvPicPr/>
+                  </pic:nvPicPr>
+                  <pic:blipFill>
+                    <a:blip r:embed="rId15"/>
+                    <a:stretch>
+                      <a:fillRect/>
+                    </a:stretch>
+                  </pic:blipFill>
+                  <pic:spPr>
+                    <a:xfrm>
+                      <a:off x="0" y="0"/>
+                      <a:ext cx="5669280" cy="2824263"/>
+                    </a:xfrm>
+                    <a:prstGeom prst="rect"/>
+                  </pic:spPr>
+                </pic:pic>
+              </a:graphicData>
+            </a:graphic>
+          </wp:inline>
+        </w:drawing>
+      </w:r>
+    </w:p>
+    <w:p>
+      <w:pPr>
+        <w:spacing w:before="40" w:after="240"/>
+        <w:jc w:val="center"/>
+      </w:pPr>
+      <w:r>
+        <w:rPr>
+          <w:rFonts w:ascii="Times New Roman" w:hAnsi="Times New Roman"/>
+          <w:b/>
+          <w:i/>
+          <w:color w:val="1F4E79"/>
+          <w:sz w:val="20"/>
+        </w:rPr>
+        <w:t>Hình 7.1: Biểu đồ đối sánh thời gian thực thi (Latency) của tập truy vấn đối chuẩn Q1 - Q4 qua 3 giai đoạn tinh chỉnh (Stage 0, Stage 1 và Stage 3)</w:t>
+      </w:r>
+    </w:p>
+    <w:p>
+      <w:pPr>
         <w:pStyle w:val="Heading2"/>
       </w:pPr>
       <w:r>
@@ -1130,6 +1539,62 @@
       <w:pPr>
         <w:spacing w:after="160"/>
       </w:pPr>
+    </w:p>
+    <w:p>
+      <w:pPr>
+        <w:spacing w:before="200" w:after="60"/>
+        <w:jc w:val="center"/>
+      </w:pPr>
+      <w:r>
+        <w:drawing>
+          <wp:inline xmlns:a="http://schemas.openxmlformats.org/drawingml/2006/main" xmlns:pic="http://schemas.openxmlformats.org/drawingml/2006/picture">
+            <wp:extent cx="5669280" cy="2539977"/>
+            <wp:docPr id="8" name="Picture 8"/>
+            <wp:cNvGraphicFramePr>
+              <a:graphicFrameLocks noChangeAspect="1"/>
+            </wp:cNvGraphicFramePr>
+            <a:graphic>
+              <a:graphicData uri="http://schemas.openxmlformats.org/drawingml/2006/picture">
+                <pic:pic>
+                  <pic:nvPicPr>
+                    <pic:cNvPr id="0" name="fig7_partition_pruning_performance.png"/>
+                    <pic:cNvPicPr/>
+                  </pic:nvPicPr>
+                  <pic:blipFill>
+                    <a:blip r:embed="rId16"/>
+                    <a:stretch>
+                      <a:fillRect/>
+                    </a:stretch>
+                  </pic:blipFill>
+                  <pic:spPr>
+                    <a:xfrm>
+                      <a:off x="0" y="0"/>
+                      <a:ext cx="5669280" cy="2539977"/>
+                    </a:xfrm>
+                    <a:prstGeom prst="rect"/>
+                  </pic:spPr>
+                </pic:pic>
+              </a:graphicData>
+            </a:graphic>
+          </wp:inline>
+        </w:drawing>
+      </w:r>
+    </w:p>
+    <w:p>
+      <w:pPr>
+        <w:spacing w:before="40" w:after="240"/>
+        <w:jc w:val="center"/>
+      </w:pPr>
+      <w:r>
+        <w:rPr>
+          <w:rFonts w:ascii="Times New Roman" w:hAnsi="Times New Roman"/>
+          <w:b/>
+          <w:i/>
+          <w:color w:val="1F4E79"/>
+          <w:sz w:val="20"/>
+        </w:rPr>
+        <w:t>Hình 7.2: Hiệu quả cắt giảm thời gian thực thi và khối lượng dữ liệu I/O đĩa của kỹ thuật Cắt tỉa Phân vùng trên câu truy vấn Q5 (Tăng tốc xấp xỉ ~10 lần)</w:t>
+      </w:r>
     </w:p>
     <w:p>
       <w:pPr>

</xml_diff>